<commit_message>
#67700 - Nouvelle fonctionnalité : Télécharger ma demande
</commit_message>
<xml_diff>
--- a/xaf-back/src/main/resources/pdfrecap/DemandeRecap.docx
+++ b/xaf-back/src/main/resources/pdfrecap/DemandeRecap.docx
@@ -217,17 +217,7 @@
                       <w:color w:val="FF0000"/>
                       <w:sz w:val="18"/>
                     </w:rPr>
-                    <w:t xml:space="preserve">Informations sur </w:t>
-                  </w:r>
-                  <w:r>
-                    <w:rPr>
-                      <w:rFonts w:ascii="Times New Roman" w:hAnsi="Times New Roman" w:cs="Times New Roman"/>
-                      <w:b/>
-                      <w:iCs/>
-                      <w:color w:val="FF0000"/>
-                      <w:sz w:val="18"/>
-                    </w:rPr>
-                    <w:t>la demande</w:t>
+                    <w:t>Informations sur la demande</w:t>
                   </w:r>
                 </w:p>
                 <w:p>
@@ -494,7 +484,16 @@
                             <w:bCs/>
                             <w:sz w:val="20"/>
                           </w:rPr>
-                          <w:t>Etat de la demande</w:t>
+                          <w:t>É</w:t>
+                        </w:r>
+                        <w:r>
+                          <w:rPr>
+                            <w:rFonts w:ascii="Times New Roman" w:hAnsi="Times New Roman" w:cs="Times New Roman"/>
+                            <w:b/>
+                            <w:bCs/>
+                            <w:sz w:val="20"/>
+                          </w:rPr>
+                          <w:t>tat de la demande</w:t>
                         </w:r>
                       </w:p>
                     </w:tc>
@@ -527,7 +526,7 @@
                             <w:szCs w:val="18"/>
                             <w:lang w:eastAsia="ja-JP"/>
                           </w:rPr>
-                          <w:instrText xml:space="preserve"> MERGEFIELD  $demande.dernierStatut.libelle  \* MERGEFORMAT </w:instrText>
+                          <w:instrText xml:space="preserve"> MERGEFIELD  $dernierStatut  \* MERGEFORMAT </w:instrText>
                         </w:r>
                         <w:r>
                           <w:rPr>
@@ -546,7 +545,7 @@
                             <w:szCs w:val="18"/>
                             <w:lang w:eastAsia="ja-JP"/>
                           </w:rPr>
-                          <w:t>«$demande.dernierStatut.libelle»</w:t>
+                          <w:t>«$dernierStatut»</w:t>
                         </w:r>
                         <w:r>
                           <w:rPr>
@@ -792,7 +791,7 @@
                       <w:rFonts w:ascii="Times New Roman" w:hAnsi="Times New Roman" w:cs="Times New Roman"/>
                       <w:sz w:val="18"/>
                       <w:szCs w:val="18"/>
-                      <w:lang w:val="en-US" w:eastAsia="ja-JP"/>
+                      <w:lang w:eastAsia="ja-JP"/>
                     </w:rPr>
                   </w:pPr>
                   <w:r>
@@ -809,7 +808,7 @@
                       <w:rFonts w:ascii="Times New Roman" w:hAnsi="Times New Roman" w:cs="Times New Roman"/>
                       <w:sz w:val="18"/>
                       <w:szCs w:val="18"/>
-                      <w:lang w:val="en-US" w:eastAsia="ja-JP"/>
+                      <w:lang w:eastAsia="ja-JP"/>
                     </w:rPr>
                     <w:instrText xml:space="preserve"> MERGEFIELD  #end  \* MERGEFORMAT </w:instrText>
                   </w:r>
@@ -828,7 +827,7 @@
                       <w:noProof/>
                       <w:sz w:val="18"/>
                       <w:szCs w:val="18"/>
-                      <w:lang w:val="en-US" w:eastAsia="ja-JP"/>
+                      <w:lang w:eastAsia="ja-JP"/>
                     </w:rPr>
                     <w:t>«#end»</w:t>
                   </w:r>
@@ -855,7 +854,7 @@
                       <w:rFonts w:ascii="Times New Roman" w:hAnsi="Times New Roman" w:cs="Times New Roman"/>
                       <w:sz w:val="18"/>
                       <w:szCs w:val="18"/>
-                      <w:lang w:val="en-US" w:eastAsia="ja-JP"/>
+                      <w:lang w:eastAsia="ja-JP"/>
                     </w:rPr>
                     <w:instrText xml:space="preserve"> MERGEFIELD  #if($infosDemande)  \* MERGEFORMAT </w:instrText>
                   </w:r>
@@ -874,7 +873,7 @@
                       <w:noProof/>
                       <w:sz w:val="18"/>
                       <w:szCs w:val="18"/>
-                      <w:lang w:val="en-US" w:eastAsia="ja-JP"/>
+                      <w:lang w:eastAsia="ja-JP"/>
                     </w:rPr>
                     <w:t>«#if($infosDemande)»</w:t>
                   </w:r>
@@ -901,7 +900,7 @@
                       <w:rFonts w:ascii="Times New Roman" w:hAnsi="Times New Roman" w:cs="Times New Roman"/>
                       <w:sz w:val="18"/>
                       <w:szCs w:val="18"/>
-                      <w:lang w:val="en-US" w:eastAsia="ja-JP"/>
+                      <w:lang w:eastAsia="ja-JP"/>
                     </w:rPr>
                     <w:instrText xml:space="preserve"> MERGEFIELD  "#foreach($mapEntry in $infosDemande.entrySet())"  \* MERGEFORMAT </w:instrText>
                   </w:r>
@@ -920,7 +919,7 @@
                       <w:noProof/>
                       <w:sz w:val="18"/>
                       <w:szCs w:val="18"/>
-                      <w:lang w:val="en-US" w:eastAsia="ja-JP"/>
+                      <w:lang w:eastAsia="ja-JP"/>
                     </w:rPr>
                     <w:t>«#foreach($mapEntry in $infosDemande.entr»</w:t>
                   </w:r>
@@ -3759,7 +3758,7 @@
         <v:path o:extrusionok="f" gradientshapeok="t" o:connecttype="rect"/>
         <o:lock v:ext="edit" aspectratio="t"/>
       </v:shapetype>
-      <v:shape id="_x0000_i1060" type="#_x0000_t75" style="width:12pt;height:12pt;visibility:visible;mso-wrap-style:square" o:bullet="t">
+      <v:shape id="_x0000_i1030" type="#_x0000_t75" style="width:12pt;height:12pt;visibility:visible;mso-wrap-style:square" o:bullet="t">
         <v:imagedata r:id="rId1" o:title=""/>
       </v:shape>
     </w:pict>
@@ -4314,6 +4313,7 @@
   <w:style w:type="character" w:default="1" w:styleId="Policepardfaut">
     <w:name w:val="Default Paragraph Font"/>
     <w:uiPriority w:val="1"/>
+    <w:semiHidden/>
     <w:unhideWhenUsed/>
   </w:style>
   <w:style w:type="table" w:default="1" w:styleId="TableauNormal">

</xml_diff>

<commit_message>
[TECH] fix "télécharger ma demande"
</commit_message>
<xml_diff>
--- a/xaf-back/src/main/resources/pdfrecap/DemandeRecap.docx
+++ b/xaf-back/src/main/resources/pdfrecap/DemandeRecap.docx
@@ -791,7 +791,7 @@
                       <w:rFonts w:ascii="Times New Roman" w:hAnsi="Times New Roman" w:cs="Times New Roman"/>
                       <w:sz w:val="18"/>
                       <w:szCs w:val="18"/>
-                      <w:lang w:val="en-US" w:eastAsia="ja-JP"/>
+                      <w:lang w:eastAsia="ja-JP"/>
                     </w:rPr>
                   </w:pPr>
                   <w:r>
@@ -808,7 +808,7 @@
                       <w:rFonts w:ascii="Times New Roman" w:hAnsi="Times New Roman" w:cs="Times New Roman"/>
                       <w:sz w:val="18"/>
                       <w:szCs w:val="18"/>
-                      <w:lang w:val="en-US" w:eastAsia="ja-JP"/>
+                      <w:lang w:eastAsia="ja-JP"/>
                     </w:rPr>
                     <w:instrText xml:space="preserve"> MERGEFIELD  #end  \* MERGEFORMAT </w:instrText>
                   </w:r>
@@ -827,7 +827,7 @@
                       <w:noProof/>
                       <w:sz w:val="18"/>
                       <w:szCs w:val="18"/>
-                      <w:lang w:val="en-US" w:eastAsia="ja-JP"/>
+                      <w:lang w:eastAsia="ja-JP"/>
                     </w:rPr>
                     <w:t>«#end»</w:t>
                   </w:r>
@@ -854,7 +854,7 @@
                       <w:rFonts w:ascii="Times New Roman" w:hAnsi="Times New Roman" w:cs="Times New Roman"/>
                       <w:sz w:val="18"/>
                       <w:szCs w:val="18"/>
-                      <w:lang w:val="en-US" w:eastAsia="ja-JP"/>
+                      <w:lang w:eastAsia="ja-JP"/>
                     </w:rPr>
                     <w:instrText xml:space="preserve"> MERGEFIELD  #if($infosDemande)  \* MERGEFORMAT </w:instrText>
                   </w:r>
@@ -873,7 +873,7 @@
                       <w:noProof/>
                       <w:sz w:val="18"/>
                       <w:szCs w:val="18"/>
-                      <w:lang w:val="en-US" w:eastAsia="ja-JP"/>
+                      <w:lang w:eastAsia="ja-JP"/>
                     </w:rPr>
                     <w:t>«#if($infosDemande)»</w:t>
                   </w:r>
@@ -900,7 +900,7 @@
                       <w:rFonts w:ascii="Times New Roman" w:hAnsi="Times New Roman" w:cs="Times New Roman"/>
                       <w:sz w:val="18"/>
                       <w:szCs w:val="18"/>
-                      <w:lang w:val="en-US" w:eastAsia="ja-JP"/>
+                      <w:lang w:eastAsia="ja-JP"/>
                     </w:rPr>
                     <w:instrText xml:space="preserve"> MERGEFIELD  "#foreach($mapEntry in $infosDemande.entrySet())"  \* MERGEFORMAT </w:instrText>
                   </w:r>
@@ -919,7 +919,7 @@
                       <w:noProof/>
                       <w:sz w:val="18"/>
                       <w:szCs w:val="18"/>
-                      <w:lang w:val="en-US" w:eastAsia="ja-JP"/>
+                      <w:lang w:eastAsia="ja-JP"/>
                     </w:rPr>
                     <w:t>«#foreach($mapEntry in $infosDemande.entr»</w:t>
                   </w:r>
@@ -3004,7 +3004,6 @@
                     </w:rPr>
                     <w:t>«#if($comp.statut == "REPONDUE")»</w:t>
                   </w:r>
-                  <w:proofErr w:type="spellStart"/>
                   <w:r>
                     <w:rPr>
                       <w:rFonts w:ascii="Times New Roman" w:hAnsi="Times New Roman" w:cs="Times New Roman"/>
@@ -3016,6 +3015,7 @@
                     </w:rPr>
                     <w:fldChar w:fldCharType="end"/>
                   </w:r>
+                  <w:proofErr w:type="spellStart"/>
                   <w:r>
                     <w:rPr>
                       <w:rFonts w:ascii="Times New Roman" w:hAnsi="Times New Roman" w:cs="Times New Roman"/>
@@ -3692,7 +3692,7 @@
                     <w:rPr>
                       <w:sz w:val="14"/>
                       <w:szCs w:val="14"/>
-                      <w:lang w:val="en-US" w:eastAsia="ja-JP"/>
+                      <w:lang w:eastAsia="ja-JP"/>
                     </w:rPr>
                     <w:instrText xml:space="preserve"> MERGEFIELD  #if($comp.reponse)  \* MERGEFORMAT </w:instrText>
                   </w:r>
@@ -3709,7 +3709,7 @@
                       <w:noProof/>
                       <w:sz w:val="14"/>
                       <w:szCs w:val="14"/>
-                      <w:lang w:val="en-US" w:eastAsia="ja-JP"/>
+                      <w:lang w:eastAsia="ja-JP"/>
                     </w:rPr>
                     <w:t>«#if($comp.reponse)»</w:t>
                   </w:r>
@@ -4011,8 +4011,12 @@
       </w:r>
     </w:p>
     <w:sectPr>
-      <w:headerReference w:type="default" r:id="rId8"/>
-      <w:footerReference w:type="default" r:id="rId9"/>
+      <w:headerReference w:type="even" r:id="rId8"/>
+      <w:headerReference w:type="default" r:id="rId9"/>
+      <w:footerReference w:type="even" r:id="rId10"/>
+      <w:footerReference w:type="default" r:id="rId11"/>
+      <w:headerReference w:type="first" r:id="rId12"/>
+      <w:footerReference w:type="first" r:id="rId13"/>
       <w:pgSz w:w="11906" w:h="16838"/>
       <w:pgMar w:top="720" w:right="720" w:bottom="720" w:left="720" w:header="142" w:footer="142" w:gutter="0"/>
       <w:cols w:space="708"/>
@@ -4048,6 +4052,16 @@
 </file>
 
 <file path=word/footer1.xml><?xml version="1.0" encoding="utf-8"?>
+<w:ftr xmlns:wpc="http://schemas.microsoft.com/office/word/2010/wordprocessingCanvas" xmlns:cx="http://schemas.microsoft.com/office/drawing/2014/chartex" xmlns:cx1="http://schemas.microsoft.com/office/drawing/2015/9/8/chartex" xmlns:cx2="http://schemas.microsoft.com/office/drawing/2015/10/21/chartex" xmlns:cx3="http://schemas.microsoft.com/office/drawing/2016/5/9/chartex" xmlns:cx4="http://schemas.microsoft.com/office/drawing/2016/5/10/chartex" xmlns:cx5="http://schemas.microsoft.com/office/drawing/2016/5/11/chartex" xmlns:cx6="http://schemas.microsoft.com/office/drawing/2016/5/12/chartex" xmlns:cx7="http://schemas.microsoft.com/office/drawing/2016/5/13/chartex" xmlns:cx8="http://schemas.microsoft.com/office/drawing/2016/5/14/chartex" xmlns:mc="http://schemas.openxmlformats.org/markup-compatibility/2006" xmlns:aink="http://schemas.microsoft.com/office/drawing/2016/ink" xmlns:am3d="http://schemas.microsoft.com/office/drawing/2017/model3d" xmlns:o="urn:schemas-microsoft-com:office:office" xmlns:oel="http://schemas.microsoft.com/office/2019/extlst" xmlns:r="http://schemas.openxmlformats.org/officeDocument/2006/relationships" xmlns:m="http://schemas.openxmlformats.org/officeDocument/2006/math" xmlns:v="urn:schemas-microsoft-com:vml" xmlns:wp14="http://schemas.microsoft.com/office/word/2010/wordprocessingDrawing" xmlns:wp="http://schemas.openxmlformats.org/drawingml/2006/wordprocessingDrawing" xmlns:w10="urn:schemas-microsoft-com:office:word" xmlns:w="http://schemas.openxmlformats.org/wordprocessingml/2006/main" xmlns:w14="http://schemas.microsoft.com/office/word/2010/wordml" xmlns:w15="http://schemas.microsoft.com/office/word/2012/wordml" xmlns:w16cex="http://schemas.microsoft.com/office/word/2018/wordml/cex" xmlns:w16cid="http://schemas.microsoft.com/office/word/2016/wordml/cid" xmlns:w16="http://schemas.microsoft.com/office/word/2018/wordml" xmlns:w16sdtdh="http://schemas.microsoft.com/office/word/2020/wordml/sdtdatahash" xmlns:w16se="http://schemas.microsoft.com/office/word/2015/wordml/symex" xmlns:wpg="http://schemas.microsoft.com/office/word/2010/wordprocessingGroup" xmlns:wpi="http://schemas.microsoft.com/office/word/2010/wordprocessingInk" xmlns:wne="http://schemas.microsoft.com/office/word/2006/wordml" xmlns:wps="http://schemas.microsoft.com/office/word/2010/wordprocessingShape" mc:Ignorable="w14 w15 w16se w16cid w16 w16cex w16sdtdh wp14">
+  <w:p>
+    <w:pPr>
+      <w:pStyle w:val="Pieddepage"/>
+    </w:pPr>
+  </w:p>
+</w:ftr>
+</file>
+
+<file path=word/footer2.xml><?xml version="1.0" encoding="utf-8"?>
 <w:ftr xmlns:wpc="http://schemas.microsoft.com/office/word/2010/wordprocessingCanvas" xmlns:cx="http://schemas.microsoft.com/office/drawing/2014/chartex" xmlns:cx1="http://schemas.microsoft.com/office/drawing/2015/9/8/chartex" xmlns:cx2="http://schemas.microsoft.com/office/drawing/2015/10/21/chartex" xmlns:cx3="http://schemas.microsoft.com/office/drawing/2016/5/9/chartex" xmlns:cx4="http://schemas.microsoft.com/office/drawing/2016/5/10/chartex" xmlns:cx5="http://schemas.microsoft.com/office/drawing/2016/5/11/chartex" xmlns:cx6="http://schemas.microsoft.com/office/drawing/2016/5/12/chartex" xmlns:cx7="http://schemas.microsoft.com/office/drawing/2016/5/13/chartex" xmlns:cx8="http://schemas.microsoft.com/office/drawing/2016/5/14/chartex" xmlns:mc="http://schemas.openxmlformats.org/markup-compatibility/2006" xmlns:aink="http://schemas.microsoft.com/office/drawing/2016/ink" xmlns:am3d="http://schemas.microsoft.com/office/drawing/2017/model3d" xmlns:o="urn:schemas-microsoft-com:office:office" xmlns:oel="http://schemas.microsoft.com/office/2019/extlst" xmlns:r="http://schemas.openxmlformats.org/officeDocument/2006/relationships" xmlns:m="http://schemas.openxmlformats.org/officeDocument/2006/math" xmlns:v="urn:schemas-microsoft-com:vml" xmlns:wp14="http://schemas.microsoft.com/office/word/2010/wordprocessingDrawing" xmlns:wp="http://schemas.openxmlformats.org/drawingml/2006/wordprocessingDrawing" xmlns:w10="urn:schemas-microsoft-com:office:word" xmlns:w="http://schemas.openxmlformats.org/wordprocessingml/2006/main" xmlns:w14="http://schemas.microsoft.com/office/word/2010/wordml" xmlns:w15="http://schemas.microsoft.com/office/word/2012/wordml" xmlns:w16cex="http://schemas.microsoft.com/office/word/2018/wordml/cex" xmlns:w16cid="http://schemas.microsoft.com/office/word/2016/wordml/cid" xmlns:w16="http://schemas.microsoft.com/office/word/2018/wordml" xmlns:w16sdtdh="http://schemas.microsoft.com/office/word/2020/wordml/sdtdatahash" xmlns:w16se="http://schemas.microsoft.com/office/word/2015/wordml/symex" xmlns:wpg="http://schemas.microsoft.com/office/word/2010/wordprocessingGroup" xmlns:wpi="http://schemas.microsoft.com/office/word/2010/wordprocessingInk" xmlns:wne="http://schemas.microsoft.com/office/word/2006/wordml" xmlns:wps="http://schemas.microsoft.com/office/word/2010/wordprocessingShape" mc:Ignorable="w14 w15 w16se w16cid w16 w16cex w16sdtdh wp14">
   <w:tbl>
     <w:tblPr>
@@ -4264,6 +4278,16 @@
 </w:ftr>
 </file>
 
+<file path=word/footer3.xml><?xml version="1.0" encoding="utf-8"?>
+<w:ftr xmlns:wpc="http://schemas.microsoft.com/office/word/2010/wordprocessingCanvas" xmlns:cx="http://schemas.microsoft.com/office/drawing/2014/chartex" xmlns:cx1="http://schemas.microsoft.com/office/drawing/2015/9/8/chartex" xmlns:cx2="http://schemas.microsoft.com/office/drawing/2015/10/21/chartex" xmlns:cx3="http://schemas.microsoft.com/office/drawing/2016/5/9/chartex" xmlns:cx4="http://schemas.microsoft.com/office/drawing/2016/5/10/chartex" xmlns:cx5="http://schemas.microsoft.com/office/drawing/2016/5/11/chartex" xmlns:cx6="http://schemas.microsoft.com/office/drawing/2016/5/12/chartex" xmlns:cx7="http://schemas.microsoft.com/office/drawing/2016/5/13/chartex" xmlns:cx8="http://schemas.microsoft.com/office/drawing/2016/5/14/chartex" xmlns:mc="http://schemas.openxmlformats.org/markup-compatibility/2006" xmlns:aink="http://schemas.microsoft.com/office/drawing/2016/ink" xmlns:am3d="http://schemas.microsoft.com/office/drawing/2017/model3d" xmlns:o="urn:schemas-microsoft-com:office:office" xmlns:oel="http://schemas.microsoft.com/office/2019/extlst" xmlns:r="http://schemas.openxmlformats.org/officeDocument/2006/relationships" xmlns:m="http://schemas.openxmlformats.org/officeDocument/2006/math" xmlns:v="urn:schemas-microsoft-com:vml" xmlns:wp14="http://schemas.microsoft.com/office/word/2010/wordprocessingDrawing" xmlns:wp="http://schemas.openxmlformats.org/drawingml/2006/wordprocessingDrawing" xmlns:w10="urn:schemas-microsoft-com:office:word" xmlns:w="http://schemas.openxmlformats.org/wordprocessingml/2006/main" xmlns:w14="http://schemas.microsoft.com/office/word/2010/wordml" xmlns:w15="http://schemas.microsoft.com/office/word/2012/wordml" xmlns:w16cex="http://schemas.microsoft.com/office/word/2018/wordml/cex" xmlns:w16cid="http://schemas.microsoft.com/office/word/2016/wordml/cid" xmlns:w16="http://schemas.microsoft.com/office/word/2018/wordml" xmlns:w16sdtdh="http://schemas.microsoft.com/office/word/2020/wordml/sdtdatahash" xmlns:w16se="http://schemas.microsoft.com/office/word/2015/wordml/symex" xmlns:wpg="http://schemas.microsoft.com/office/word/2010/wordprocessingGroup" xmlns:wpi="http://schemas.microsoft.com/office/word/2010/wordprocessingInk" xmlns:wne="http://schemas.microsoft.com/office/word/2006/wordml" xmlns:wps="http://schemas.microsoft.com/office/word/2010/wordprocessingShape" mc:Ignorable="w14 w15 w16se w16cid w16 w16cex w16sdtdh wp14">
+  <w:p>
+    <w:pPr>
+      <w:pStyle w:val="Pieddepage"/>
+    </w:pPr>
+  </w:p>
+</w:ftr>
+</file>
+
 <file path=word/footnotes.xml><?xml version="1.0" encoding="utf-8"?>
 <w:footnotes xmlns:wpc="http://schemas.microsoft.com/office/word/2010/wordprocessingCanvas" xmlns:cx="http://schemas.microsoft.com/office/drawing/2014/chartex" xmlns:cx1="http://schemas.microsoft.com/office/drawing/2015/9/8/chartex" xmlns:cx2="http://schemas.microsoft.com/office/drawing/2015/10/21/chartex" xmlns:cx3="http://schemas.microsoft.com/office/drawing/2016/5/9/chartex" xmlns:cx4="http://schemas.microsoft.com/office/drawing/2016/5/10/chartex" xmlns:cx5="http://schemas.microsoft.com/office/drawing/2016/5/11/chartex" xmlns:cx6="http://schemas.microsoft.com/office/drawing/2016/5/12/chartex" xmlns:cx7="http://schemas.microsoft.com/office/drawing/2016/5/13/chartex" xmlns:cx8="http://schemas.microsoft.com/office/drawing/2016/5/14/chartex" xmlns:mc="http://schemas.openxmlformats.org/markup-compatibility/2006" xmlns:aink="http://schemas.microsoft.com/office/drawing/2016/ink" xmlns:am3d="http://schemas.microsoft.com/office/drawing/2017/model3d" xmlns:o="urn:schemas-microsoft-com:office:office" xmlns:oel="http://schemas.microsoft.com/office/2019/extlst" xmlns:r="http://schemas.openxmlformats.org/officeDocument/2006/relationships" xmlns:m="http://schemas.openxmlformats.org/officeDocument/2006/math" xmlns:v="urn:schemas-microsoft-com:vml" xmlns:wp14="http://schemas.microsoft.com/office/word/2010/wordprocessingDrawing" xmlns:wp="http://schemas.openxmlformats.org/drawingml/2006/wordprocessingDrawing" xmlns:w10="urn:schemas-microsoft-com:office:word" xmlns:w="http://schemas.openxmlformats.org/wordprocessingml/2006/main" xmlns:w14="http://schemas.microsoft.com/office/word/2010/wordml" xmlns:w15="http://schemas.microsoft.com/office/word/2012/wordml" xmlns:w16cex="http://schemas.microsoft.com/office/word/2018/wordml/cex" xmlns:w16cid="http://schemas.microsoft.com/office/word/2016/wordml/cid" xmlns:w16="http://schemas.microsoft.com/office/word/2018/wordml" xmlns:w16sdtdh="http://schemas.microsoft.com/office/word/2020/wordml/sdtdatahash" xmlns:w16se="http://schemas.microsoft.com/office/word/2015/wordml/symex" xmlns:wpg="http://schemas.microsoft.com/office/word/2010/wordprocessingGroup" xmlns:wpi="http://schemas.microsoft.com/office/word/2010/wordprocessingInk" xmlns:wne="http://schemas.microsoft.com/office/word/2006/wordml" xmlns:wps="http://schemas.microsoft.com/office/word/2010/wordprocessingShape" mc:Ignorable="w14 w15 w16se w16cid w16 w16cex w16sdtdh wp14">
   <w:footnote w:type="separator" w:id="-1">
@@ -4291,6 +4315,16 @@
 
 <file path=word/header1.xml><?xml version="1.0" encoding="utf-8"?>
 <w:hdr xmlns:wpc="http://schemas.microsoft.com/office/word/2010/wordprocessingCanvas" xmlns:cx="http://schemas.microsoft.com/office/drawing/2014/chartex" xmlns:cx1="http://schemas.microsoft.com/office/drawing/2015/9/8/chartex" xmlns:cx2="http://schemas.microsoft.com/office/drawing/2015/10/21/chartex" xmlns:cx3="http://schemas.microsoft.com/office/drawing/2016/5/9/chartex" xmlns:cx4="http://schemas.microsoft.com/office/drawing/2016/5/10/chartex" xmlns:cx5="http://schemas.microsoft.com/office/drawing/2016/5/11/chartex" xmlns:cx6="http://schemas.microsoft.com/office/drawing/2016/5/12/chartex" xmlns:cx7="http://schemas.microsoft.com/office/drawing/2016/5/13/chartex" xmlns:cx8="http://schemas.microsoft.com/office/drawing/2016/5/14/chartex" xmlns:mc="http://schemas.openxmlformats.org/markup-compatibility/2006" xmlns:aink="http://schemas.microsoft.com/office/drawing/2016/ink" xmlns:am3d="http://schemas.microsoft.com/office/drawing/2017/model3d" xmlns:o="urn:schemas-microsoft-com:office:office" xmlns:oel="http://schemas.microsoft.com/office/2019/extlst" xmlns:r="http://schemas.openxmlformats.org/officeDocument/2006/relationships" xmlns:m="http://schemas.openxmlformats.org/officeDocument/2006/math" xmlns:v="urn:schemas-microsoft-com:vml" xmlns:wp14="http://schemas.microsoft.com/office/word/2010/wordprocessingDrawing" xmlns:wp="http://schemas.openxmlformats.org/drawingml/2006/wordprocessingDrawing" xmlns:w10="urn:schemas-microsoft-com:office:word" xmlns:w="http://schemas.openxmlformats.org/wordprocessingml/2006/main" xmlns:w14="http://schemas.microsoft.com/office/word/2010/wordml" xmlns:w15="http://schemas.microsoft.com/office/word/2012/wordml" xmlns:w16cex="http://schemas.microsoft.com/office/word/2018/wordml/cex" xmlns:w16cid="http://schemas.microsoft.com/office/word/2016/wordml/cid" xmlns:w16="http://schemas.microsoft.com/office/word/2018/wordml" xmlns:w16sdtdh="http://schemas.microsoft.com/office/word/2020/wordml/sdtdatahash" xmlns:w16se="http://schemas.microsoft.com/office/word/2015/wordml/symex" xmlns:wpg="http://schemas.microsoft.com/office/word/2010/wordprocessingGroup" xmlns:wpi="http://schemas.microsoft.com/office/word/2010/wordprocessingInk" xmlns:wne="http://schemas.microsoft.com/office/word/2006/wordml" xmlns:wps="http://schemas.microsoft.com/office/word/2010/wordprocessingShape" mc:Ignorable="w14 w15 w16se w16cid w16 w16cex w16sdtdh wp14">
+  <w:p>
+    <w:pPr>
+      <w:pStyle w:val="En-tte"/>
+    </w:pPr>
+  </w:p>
+</w:hdr>
+</file>
+
+<file path=word/header2.xml><?xml version="1.0" encoding="utf-8"?>
+<w:hdr xmlns:wpc="http://schemas.microsoft.com/office/word/2010/wordprocessingCanvas" xmlns:cx="http://schemas.microsoft.com/office/drawing/2014/chartex" xmlns:cx1="http://schemas.microsoft.com/office/drawing/2015/9/8/chartex" xmlns:cx2="http://schemas.microsoft.com/office/drawing/2015/10/21/chartex" xmlns:cx3="http://schemas.microsoft.com/office/drawing/2016/5/9/chartex" xmlns:cx4="http://schemas.microsoft.com/office/drawing/2016/5/10/chartex" xmlns:cx5="http://schemas.microsoft.com/office/drawing/2016/5/11/chartex" xmlns:cx6="http://schemas.microsoft.com/office/drawing/2016/5/12/chartex" xmlns:cx7="http://schemas.microsoft.com/office/drawing/2016/5/13/chartex" xmlns:cx8="http://schemas.microsoft.com/office/drawing/2016/5/14/chartex" xmlns:mc="http://schemas.openxmlformats.org/markup-compatibility/2006" xmlns:aink="http://schemas.microsoft.com/office/drawing/2016/ink" xmlns:am3d="http://schemas.microsoft.com/office/drawing/2017/model3d" xmlns:o="urn:schemas-microsoft-com:office:office" xmlns:oel="http://schemas.microsoft.com/office/2019/extlst" xmlns:r="http://schemas.openxmlformats.org/officeDocument/2006/relationships" xmlns:m="http://schemas.openxmlformats.org/officeDocument/2006/math" xmlns:v="urn:schemas-microsoft-com:vml" xmlns:wp14="http://schemas.microsoft.com/office/word/2010/wordprocessingDrawing" xmlns:wp="http://schemas.openxmlformats.org/drawingml/2006/wordprocessingDrawing" xmlns:w10="urn:schemas-microsoft-com:office:word" xmlns:w="http://schemas.openxmlformats.org/wordprocessingml/2006/main" xmlns:w14="http://schemas.microsoft.com/office/word/2010/wordml" xmlns:w15="http://schemas.microsoft.com/office/word/2012/wordml" xmlns:w16cex="http://schemas.microsoft.com/office/word/2018/wordml/cex" xmlns:w16cid="http://schemas.microsoft.com/office/word/2016/wordml/cid" xmlns:w16="http://schemas.microsoft.com/office/word/2018/wordml" xmlns:w16sdtdh="http://schemas.microsoft.com/office/word/2020/wordml/sdtdatahash" xmlns:w16se="http://schemas.microsoft.com/office/word/2015/wordml/symex" xmlns:wpg="http://schemas.microsoft.com/office/word/2010/wordprocessingGroup" xmlns:wpi="http://schemas.microsoft.com/office/word/2010/wordprocessingInk" xmlns:wne="http://schemas.microsoft.com/office/word/2006/wordml" xmlns:wps="http://schemas.microsoft.com/office/word/2010/wordprocessingShape" mc:Ignorable="w14 w15 w16se w16cid w16 w16cex w16sdtdh wp14">
   <w:tbl>
     <w:tblPr>
       <w:tblStyle w:val="Grilledutableau"/>
@@ -4307,8 +4341,8 @@
       <w:tblLook w:val="04A0" w:firstRow="1" w:lastRow="0" w:firstColumn="1" w:lastColumn="0" w:noHBand="0" w:noVBand="1"/>
     </w:tblPr>
     <w:tblGrid>
-      <w:gridCol w:w="5254"/>
-      <w:gridCol w:w="4687"/>
+      <w:gridCol w:w="3781"/>
+      <w:gridCol w:w="6160"/>
     </w:tblGrid>
     <w:tr>
       <w:trPr>
@@ -4540,6 +4574,57 @@
               <w:sz w:val="20"/>
               <w:szCs w:val="20"/>
             </w:rPr>
+            <w:instrText xml:space="preserve"> MERGEFIELD  #if($nomSousDirectionComplement)  \* MERGEFORMAT </w:instrText>
+          </w:r>
+          <w:r>
+            <w:rPr>
+              <w:rFonts w:ascii="Times New Roman" w:hAnsi="Times New Roman" w:cs="Times New Roman"/>
+              <w:i/>
+              <w:iCs/>
+              <w:sz w:val="20"/>
+              <w:szCs w:val="20"/>
+            </w:rPr>
+            <w:fldChar w:fldCharType="separate"/>
+          </w:r>
+          <w:r>
+            <w:rPr>
+              <w:rFonts w:ascii="Times New Roman" w:hAnsi="Times New Roman" w:cs="Times New Roman"/>
+              <w:i/>
+              <w:iCs/>
+              <w:noProof/>
+              <w:sz w:val="20"/>
+              <w:szCs w:val="20"/>
+            </w:rPr>
+            <w:t>«#if($nomSousDirectionComplement)»</w:t>
+          </w:r>
+          <w:r>
+            <w:rPr>
+              <w:rFonts w:ascii="Times New Roman" w:hAnsi="Times New Roman" w:cs="Times New Roman"/>
+              <w:i/>
+              <w:iCs/>
+              <w:sz w:val="20"/>
+              <w:szCs w:val="20"/>
+            </w:rPr>
+            <w:fldChar w:fldCharType="end"/>
+          </w:r>
+          <w:r>
+            <w:rPr>
+              <w:rFonts w:ascii="Times New Roman" w:hAnsi="Times New Roman" w:cs="Times New Roman"/>
+              <w:i/>
+              <w:iCs/>
+              <w:sz w:val="20"/>
+              <w:szCs w:val="20"/>
+            </w:rPr>
+            <w:fldChar w:fldCharType="begin"/>
+          </w:r>
+          <w:r>
+            <w:rPr>
+              <w:rFonts w:ascii="Times New Roman" w:hAnsi="Times New Roman" w:cs="Times New Roman"/>
+              <w:i/>
+              <w:iCs/>
+              <w:sz w:val="20"/>
+              <w:szCs w:val="20"/>
+            </w:rPr>
             <w:instrText xml:space="preserve"> MERGEFIELD  $nomSousDirectionComplement  \* MERGEFORMAT </w:instrText>
           </w:r>
           <w:r>
@@ -4573,6 +4658,67 @@
             </w:rPr>
             <w:fldChar w:fldCharType="end"/>
           </w:r>
+          <w:r>
+            <w:rPr>
+              <w:rFonts w:ascii="Times New Roman" w:hAnsi="Times New Roman" w:cs="Times New Roman"/>
+              <w:i/>
+              <w:iCs/>
+              <w:sz w:val="20"/>
+              <w:szCs w:val="20"/>
+            </w:rPr>
+            <w:t xml:space="preserve"> </w:t>
+          </w:r>
+          <w:r>
+            <w:rPr>
+              <w:rFonts w:ascii="Times New Roman" w:hAnsi="Times New Roman" w:cs="Times New Roman"/>
+              <w:i/>
+              <w:iCs/>
+              <w:sz w:val="20"/>
+              <w:szCs w:val="20"/>
+            </w:rPr>
+            <w:fldChar w:fldCharType="begin"/>
+          </w:r>
+          <w:r>
+            <w:rPr>
+              <w:rFonts w:ascii="Times New Roman" w:hAnsi="Times New Roman" w:cs="Times New Roman"/>
+              <w:i/>
+              <w:iCs/>
+              <w:sz w:val="20"/>
+              <w:szCs w:val="20"/>
+            </w:rPr>
+            <w:instrText xml:space="preserve"> MERGEFIELD  #end  \* MERGEFORMAT </w:instrText>
+          </w:r>
+          <w:r>
+            <w:rPr>
+              <w:rFonts w:ascii="Times New Roman" w:hAnsi="Times New Roman" w:cs="Times New Roman"/>
+              <w:i/>
+              <w:iCs/>
+              <w:sz w:val="20"/>
+              <w:szCs w:val="20"/>
+            </w:rPr>
+            <w:fldChar w:fldCharType="separate"/>
+          </w:r>
+          <w:r>
+            <w:rPr>
+              <w:rFonts w:ascii="Times New Roman" w:hAnsi="Times New Roman" w:cs="Times New Roman"/>
+              <w:i/>
+              <w:iCs/>
+              <w:noProof/>
+              <w:sz w:val="20"/>
+              <w:szCs w:val="20"/>
+            </w:rPr>
+            <w:t>«#end»</w:t>
+          </w:r>
+          <w:r>
+            <w:rPr>
+              <w:rFonts w:ascii="Times New Roman" w:hAnsi="Times New Roman" w:cs="Times New Roman"/>
+              <w:i/>
+              <w:iCs/>
+              <w:sz w:val="20"/>
+              <w:szCs w:val="20"/>
+            </w:rPr>
+            <w:fldChar w:fldCharType="end"/>
+          </w:r>
         </w:p>
       </w:tc>
     </w:tr>
@@ -4581,6 +4727,16 @@
     <w:pPr>
       <w:pStyle w:val="En-tte"/>
       <w:jc w:val="center"/>
+    </w:pPr>
+  </w:p>
+</w:hdr>
+</file>
+
+<file path=word/header3.xml><?xml version="1.0" encoding="utf-8"?>
+<w:hdr xmlns:wpc="http://schemas.microsoft.com/office/word/2010/wordprocessingCanvas" xmlns:cx="http://schemas.microsoft.com/office/drawing/2014/chartex" xmlns:cx1="http://schemas.microsoft.com/office/drawing/2015/9/8/chartex" xmlns:cx2="http://schemas.microsoft.com/office/drawing/2015/10/21/chartex" xmlns:cx3="http://schemas.microsoft.com/office/drawing/2016/5/9/chartex" xmlns:cx4="http://schemas.microsoft.com/office/drawing/2016/5/10/chartex" xmlns:cx5="http://schemas.microsoft.com/office/drawing/2016/5/11/chartex" xmlns:cx6="http://schemas.microsoft.com/office/drawing/2016/5/12/chartex" xmlns:cx7="http://schemas.microsoft.com/office/drawing/2016/5/13/chartex" xmlns:cx8="http://schemas.microsoft.com/office/drawing/2016/5/14/chartex" xmlns:mc="http://schemas.openxmlformats.org/markup-compatibility/2006" xmlns:aink="http://schemas.microsoft.com/office/drawing/2016/ink" xmlns:am3d="http://schemas.microsoft.com/office/drawing/2017/model3d" xmlns:o="urn:schemas-microsoft-com:office:office" xmlns:oel="http://schemas.microsoft.com/office/2019/extlst" xmlns:r="http://schemas.openxmlformats.org/officeDocument/2006/relationships" xmlns:m="http://schemas.openxmlformats.org/officeDocument/2006/math" xmlns:v="urn:schemas-microsoft-com:vml" xmlns:wp14="http://schemas.microsoft.com/office/word/2010/wordprocessingDrawing" xmlns:wp="http://schemas.openxmlformats.org/drawingml/2006/wordprocessingDrawing" xmlns:w10="urn:schemas-microsoft-com:office:word" xmlns:w="http://schemas.openxmlformats.org/wordprocessingml/2006/main" xmlns:w14="http://schemas.microsoft.com/office/word/2010/wordml" xmlns:w15="http://schemas.microsoft.com/office/word/2012/wordml" xmlns:w16cex="http://schemas.microsoft.com/office/word/2018/wordml/cex" xmlns:w16cid="http://schemas.microsoft.com/office/word/2016/wordml/cid" xmlns:w16="http://schemas.microsoft.com/office/word/2018/wordml" xmlns:w16sdtdh="http://schemas.microsoft.com/office/word/2020/wordml/sdtdatahash" xmlns:w16se="http://schemas.microsoft.com/office/word/2015/wordml/symex" xmlns:wpg="http://schemas.microsoft.com/office/word/2010/wordprocessingGroup" xmlns:wpi="http://schemas.microsoft.com/office/word/2010/wordprocessingInk" xmlns:wne="http://schemas.microsoft.com/office/word/2006/wordml" xmlns:wps="http://schemas.microsoft.com/office/word/2010/wordprocessingShape" mc:Ignorable="w14 w15 w16se w16cid w16 w16cex w16sdtdh wp14">
+  <w:p>
+    <w:pPr>
+      <w:pStyle w:val="En-tte"/>
     </w:pPr>
   </w:p>
 </w:hdr>
@@ -4609,14 +4765,14 @@
         <v:path o:extrusionok="f" gradientshapeok="t" o:connecttype="rect"/>
         <o:lock v:ext="edit" aspectratio="t"/>
       </v:shapetype>
-      <v:shape id="_x0000_i1134" type="#_x0000_t75" style="width:12pt;height:12pt;visibility:visible;mso-wrap-style:square" o:bullet="t">
+      <v:shape id="_x0000_i1030" type="#_x0000_t75" style="width:12.1pt;height:12.1pt;visibility:visible;mso-wrap-style:square" o:bullet="t">
         <v:imagedata r:id="rId1" o:title=""/>
       </v:shape>
     </w:pict>
   </w:numPicBullet>
   <w:numPicBullet w:numPicBulletId="1">
     <w:pict>
-      <v:shape id="_x0000_i1135" type="#_x0000_t75" style="width:8pt;height:8pt;visibility:visible;mso-wrap-style:square" o:bullet="t">
+      <v:shape id="_x0000_i1031" type="#_x0000_t75" style="width:8.05pt;height:8.05pt;visibility:visible;mso-wrap-style:square" o:bullet="t">
         <v:imagedata r:id="rId2" o:title=""/>
       </v:shape>
     </w:pict>

</xml_diff>

<commit_message>
#70837 - [BO][En attente d'informations complémentaires][Télécharger ma demande] : PDF contient une valeur en dur.
</commit_message>
<xml_diff>
--- a/xaf-back/src/main/resources/pdfrecap/DemandeRecap.docx
+++ b/xaf-back/src/main/resources/pdfrecap/DemandeRecap.docx
@@ -3794,7 +3794,7 @@
                             <w:rFonts w:ascii="Times New Roman" w:hAnsi="Times New Roman" w:cs="Times New Roman"/>
                             <w:sz w:val="18"/>
                             <w:szCs w:val="18"/>
-                            <w:lang w:eastAsia="ja-JP"/>
+                            <w:lang w:val="en-US" w:eastAsia="ja-JP"/>
                           </w:rPr>
                         </w:pPr>
                         <w:r>
@@ -3811,7 +3811,53 @@
                             <w:rFonts w:ascii="Times New Roman" w:hAnsi="Times New Roman" w:cs="Times New Roman"/>
                             <w:sz w:val="18"/>
                             <w:szCs w:val="18"/>
-                            <w:lang w:eastAsia="ja-JP"/>
+                            <w:lang w:val="en-US" w:eastAsia="ja-JP"/>
+                          </w:rPr>
+                          <w:instrText xml:space="preserve"> MERGEFIELD  #if($comp.reponse.texte)  \* MERGEFORMAT </w:instrText>
+                        </w:r>
+                        <w:r>
+                          <w:rPr>
+                            <w:rFonts w:ascii="Times New Roman" w:hAnsi="Times New Roman" w:cs="Times New Roman"/>
+                            <w:sz w:val="18"/>
+                            <w:szCs w:val="18"/>
+                            <w:lang w:eastAsia="ja-JP"/>
+                          </w:rPr>
+                          <w:fldChar w:fldCharType="separate"/>
+                        </w:r>
+                        <w:r>
+                          <w:rPr>
+                            <w:rFonts w:ascii="Times New Roman" w:hAnsi="Times New Roman" w:cs="Times New Roman"/>
+                            <w:noProof/>
+                            <w:sz w:val="18"/>
+                            <w:szCs w:val="18"/>
+                            <w:lang w:val="en-US" w:eastAsia="ja-JP"/>
+                          </w:rPr>
+                          <w:t>«#if($comp.reponse.texte)»</w:t>
+                        </w:r>
+                        <w:r>
+                          <w:rPr>
+                            <w:rFonts w:ascii="Times New Roman" w:hAnsi="Times New Roman" w:cs="Times New Roman"/>
+                            <w:sz w:val="18"/>
+                            <w:szCs w:val="18"/>
+                            <w:lang w:eastAsia="ja-JP"/>
+                          </w:rPr>
+                          <w:fldChar w:fldCharType="end"/>
+                        </w:r>
+                        <w:r>
+                          <w:rPr>
+                            <w:rFonts w:ascii="Times New Roman" w:hAnsi="Times New Roman" w:cs="Times New Roman"/>
+                            <w:sz w:val="18"/>
+                            <w:szCs w:val="18"/>
+                            <w:lang w:eastAsia="ja-JP"/>
+                          </w:rPr>
+                          <w:fldChar w:fldCharType="begin"/>
+                        </w:r>
+                        <w:r>
+                          <w:rPr>
+                            <w:rFonts w:ascii="Times New Roman" w:hAnsi="Times New Roman" w:cs="Times New Roman"/>
+                            <w:sz w:val="18"/>
+                            <w:szCs w:val="18"/>
+                            <w:lang w:val="en-US" w:eastAsia="ja-JP"/>
                           </w:rPr>
                           <w:instrText xml:space="preserve"> MERGEFIELD  $comp.reponse.texte  \* MERGEFORMAT </w:instrText>
                         </w:r>
@@ -3830,9 +3876,55 @@
                             <w:noProof/>
                             <w:sz w:val="18"/>
                             <w:szCs w:val="18"/>
-                            <w:lang w:eastAsia="ja-JP"/>
+                            <w:lang w:val="en-US" w:eastAsia="ja-JP"/>
                           </w:rPr>
                           <w:t>«$comp.reponse.texte»</w:t>
+                        </w:r>
+                        <w:r>
+                          <w:rPr>
+                            <w:rFonts w:ascii="Times New Roman" w:hAnsi="Times New Roman" w:cs="Times New Roman"/>
+                            <w:sz w:val="18"/>
+                            <w:szCs w:val="18"/>
+                            <w:lang w:eastAsia="ja-JP"/>
+                          </w:rPr>
+                          <w:fldChar w:fldCharType="end"/>
+                        </w:r>
+                        <w:r>
+                          <w:rPr>
+                            <w:rFonts w:ascii="Times New Roman" w:hAnsi="Times New Roman" w:cs="Times New Roman"/>
+                            <w:sz w:val="18"/>
+                            <w:szCs w:val="18"/>
+                            <w:lang w:eastAsia="ja-JP"/>
+                          </w:rPr>
+                          <w:fldChar w:fldCharType="begin"/>
+                        </w:r>
+                        <w:r>
+                          <w:rPr>
+                            <w:rFonts w:ascii="Times New Roman" w:hAnsi="Times New Roman" w:cs="Times New Roman"/>
+                            <w:sz w:val="18"/>
+                            <w:szCs w:val="18"/>
+                            <w:lang w:val="en-US" w:eastAsia="ja-JP"/>
+                          </w:rPr>
+                          <w:instrText xml:space="preserve"> MERGEFIELD  #end  \* MERGEFORMAT </w:instrText>
+                        </w:r>
+                        <w:r>
+                          <w:rPr>
+                            <w:rFonts w:ascii="Times New Roman" w:hAnsi="Times New Roman" w:cs="Times New Roman"/>
+                            <w:sz w:val="18"/>
+                            <w:szCs w:val="18"/>
+                            <w:lang w:eastAsia="ja-JP"/>
+                          </w:rPr>
+                          <w:fldChar w:fldCharType="separate"/>
+                        </w:r>
+                        <w:r>
+                          <w:rPr>
+                            <w:rFonts w:ascii="Times New Roman" w:hAnsi="Times New Roman" w:cs="Times New Roman"/>
+                            <w:noProof/>
+                            <w:sz w:val="18"/>
+                            <w:szCs w:val="18"/>
+                            <w:lang w:val="en-US" w:eastAsia="ja-JP"/>
+                          </w:rPr>
+                          <w:t>«#end»</w:t>
                         </w:r>
                         <w:r>
                           <w:rPr>
@@ -4765,14 +4857,14 @@
         <v:path o:extrusionok="f" gradientshapeok="t" o:connecttype="rect"/>
         <o:lock v:ext="edit" aspectratio="t"/>
       </v:shapetype>
-      <v:shape id="_x0000_i1030" type="#_x0000_t75" style="width:12.1pt;height:12.1pt;visibility:visible;mso-wrap-style:square" o:bullet="t">
+      <v:shape id="_x0000_i1032" type="#_x0000_t75" style="width:12.1pt;height:12.1pt;visibility:visible;mso-wrap-style:square" o:bullet="t">
         <v:imagedata r:id="rId1" o:title=""/>
       </v:shape>
     </w:pict>
   </w:numPicBullet>
   <w:numPicBullet w:numPicBulletId="1">
     <w:pict>
-      <v:shape id="_x0000_i1031" type="#_x0000_t75" style="width:8.05pt;height:8.05pt;visibility:visible;mso-wrap-style:square" o:bullet="t">
+      <v:shape id="_x0000_i1033" type="#_x0000_t75" style="width:8.05pt;height:8.05pt;visibility:visible;mso-wrap-style:square" o:bullet="t">
         <v:imagedata r:id="rId2" o:title=""/>
       </v:shape>
     </w:pict>

</xml_diff>

<commit_message>
refs #70964 - [FO] Erreur 500 suite Télécharger ma demande
</commit_message>
<xml_diff>
--- a/xaf-back/src/main/resources/pdfrecap/DemandeRecap.docx
+++ b/xaf-back/src/main/resources/pdfrecap/DemandeRecap.docx
@@ -3794,7 +3794,7 @@
                             <w:rFonts w:ascii="Times New Roman" w:hAnsi="Times New Roman" w:cs="Times New Roman"/>
                             <w:sz w:val="18"/>
                             <w:szCs w:val="18"/>
-                            <w:lang w:eastAsia="ja-JP"/>
+                            <w:lang w:val="en-US" w:eastAsia="ja-JP"/>
                           </w:rPr>
                         </w:pPr>
                         <w:r>
@@ -3811,7 +3811,53 @@
                             <w:rFonts w:ascii="Times New Roman" w:hAnsi="Times New Roman" w:cs="Times New Roman"/>
                             <w:sz w:val="18"/>
                             <w:szCs w:val="18"/>
-                            <w:lang w:eastAsia="ja-JP"/>
+                            <w:lang w:val="en-US" w:eastAsia="ja-JP"/>
+                          </w:rPr>
+                          <w:instrText xml:space="preserve"> MERGEFIELD  #if($comp.reponse.texte)  \* MERGEFORMAT </w:instrText>
+                        </w:r>
+                        <w:r>
+                          <w:rPr>
+                            <w:rFonts w:ascii="Times New Roman" w:hAnsi="Times New Roman" w:cs="Times New Roman"/>
+                            <w:sz w:val="18"/>
+                            <w:szCs w:val="18"/>
+                            <w:lang w:eastAsia="ja-JP"/>
+                          </w:rPr>
+                          <w:fldChar w:fldCharType="separate"/>
+                        </w:r>
+                        <w:r>
+                          <w:rPr>
+                            <w:rFonts w:ascii="Times New Roman" w:hAnsi="Times New Roman" w:cs="Times New Roman"/>
+                            <w:noProof/>
+                            <w:sz w:val="18"/>
+                            <w:szCs w:val="18"/>
+                            <w:lang w:val="en-US" w:eastAsia="ja-JP"/>
+                          </w:rPr>
+                          <w:t>«#if($comp.reponse.texte)»</w:t>
+                        </w:r>
+                        <w:r>
+                          <w:rPr>
+                            <w:rFonts w:ascii="Times New Roman" w:hAnsi="Times New Roman" w:cs="Times New Roman"/>
+                            <w:sz w:val="18"/>
+                            <w:szCs w:val="18"/>
+                            <w:lang w:eastAsia="ja-JP"/>
+                          </w:rPr>
+                          <w:fldChar w:fldCharType="end"/>
+                        </w:r>
+                        <w:r>
+                          <w:rPr>
+                            <w:rFonts w:ascii="Times New Roman" w:hAnsi="Times New Roman" w:cs="Times New Roman"/>
+                            <w:sz w:val="18"/>
+                            <w:szCs w:val="18"/>
+                            <w:lang w:eastAsia="ja-JP"/>
+                          </w:rPr>
+                          <w:fldChar w:fldCharType="begin"/>
+                        </w:r>
+                        <w:r>
+                          <w:rPr>
+                            <w:rFonts w:ascii="Times New Roman" w:hAnsi="Times New Roman" w:cs="Times New Roman"/>
+                            <w:sz w:val="18"/>
+                            <w:szCs w:val="18"/>
+                            <w:lang w:val="en-US" w:eastAsia="ja-JP"/>
                           </w:rPr>
                           <w:instrText xml:space="preserve"> MERGEFIELD  $comp.reponse.texte  \* MERGEFORMAT </w:instrText>
                         </w:r>
@@ -3830,9 +3876,55 @@
                             <w:noProof/>
                             <w:sz w:val="18"/>
                             <w:szCs w:val="18"/>
-                            <w:lang w:eastAsia="ja-JP"/>
+                            <w:lang w:val="en-US" w:eastAsia="ja-JP"/>
                           </w:rPr>
                           <w:t>«$comp.reponse.texte»</w:t>
+                        </w:r>
+                        <w:r>
+                          <w:rPr>
+                            <w:rFonts w:ascii="Times New Roman" w:hAnsi="Times New Roman" w:cs="Times New Roman"/>
+                            <w:sz w:val="18"/>
+                            <w:szCs w:val="18"/>
+                            <w:lang w:eastAsia="ja-JP"/>
+                          </w:rPr>
+                          <w:fldChar w:fldCharType="end"/>
+                        </w:r>
+                        <w:r>
+                          <w:rPr>
+                            <w:rFonts w:ascii="Times New Roman" w:hAnsi="Times New Roman" w:cs="Times New Roman"/>
+                            <w:sz w:val="18"/>
+                            <w:szCs w:val="18"/>
+                            <w:lang w:eastAsia="ja-JP"/>
+                          </w:rPr>
+                          <w:fldChar w:fldCharType="begin"/>
+                        </w:r>
+                        <w:r>
+                          <w:rPr>
+                            <w:rFonts w:ascii="Times New Roman" w:hAnsi="Times New Roman" w:cs="Times New Roman"/>
+                            <w:sz w:val="18"/>
+                            <w:szCs w:val="18"/>
+                            <w:lang w:val="en-US" w:eastAsia="ja-JP"/>
+                          </w:rPr>
+                          <w:instrText xml:space="preserve"> MERGEFIELD  #end  \* MERGEFORMAT </w:instrText>
+                        </w:r>
+                        <w:r>
+                          <w:rPr>
+                            <w:rFonts w:ascii="Times New Roman" w:hAnsi="Times New Roman" w:cs="Times New Roman"/>
+                            <w:sz w:val="18"/>
+                            <w:szCs w:val="18"/>
+                            <w:lang w:eastAsia="ja-JP"/>
+                          </w:rPr>
+                          <w:fldChar w:fldCharType="separate"/>
+                        </w:r>
+                        <w:r>
+                          <w:rPr>
+                            <w:rFonts w:ascii="Times New Roman" w:hAnsi="Times New Roman" w:cs="Times New Roman"/>
+                            <w:noProof/>
+                            <w:sz w:val="18"/>
+                            <w:szCs w:val="18"/>
+                            <w:lang w:val="en-US" w:eastAsia="ja-JP"/>
+                          </w:rPr>
+                          <w:t>«#end»</w:t>
                         </w:r>
                         <w:r>
                           <w:rPr>
@@ -4765,14 +4857,14 @@
         <v:path o:extrusionok="f" gradientshapeok="t" o:connecttype="rect"/>
         <o:lock v:ext="edit" aspectratio="t"/>
       </v:shapetype>
-      <v:shape id="_x0000_i1030" type="#_x0000_t75" style="width:12.1pt;height:12.1pt;visibility:visible;mso-wrap-style:square" o:bullet="t">
+      <v:shape id="_x0000_i1032" type="#_x0000_t75" style="width:12.1pt;height:12.1pt;visibility:visible;mso-wrap-style:square" o:bullet="t">
         <v:imagedata r:id="rId1" o:title=""/>
       </v:shape>
     </w:pict>
   </w:numPicBullet>
   <w:numPicBullet w:numPicBulletId="1">
     <w:pict>
-      <v:shape id="_x0000_i1031" type="#_x0000_t75" style="width:8.05pt;height:8.05pt;visibility:visible;mso-wrap-style:square" o:bullet="t">
+      <v:shape id="_x0000_i1033" type="#_x0000_t75" style="width:8.05pt;height:8.05pt;visibility:visible;mso-wrap-style:square" o:bullet="t">
         <v:imagedata r:id="rId2" o:title=""/>
       </v:shape>
     </w:pict>

</xml_diff>

<commit_message>
#73542 - Rendre nomSousDirection optionnel pour "télécharger ma demande"
</commit_message>
<xml_diff>
--- a/xaf-back/src/main/resources/pdfrecap/DemandeRecap.docx
+++ b/xaf-back/src/main/resources/pdfrecap/DemandeRecap.docx
@@ -4103,12 +4103,8 @@
       </w:r>
     </w:p>
     <w:sectPr>
-      <w:headerReference w:type="even" r:id="rId8"/>
-      <w:headerReference w:type="default" r:id="rId9"/>
-      <w:footerReference w:type="even" r:id="rId10"/>
-      <w:footerReference w:type="default" r:id="rId11"/>
-      <w:headerReference w:type="first" r:id="rId12"/>
-      <w:footerReference w:type="first" r:id="rId13"/>
+      <w:headerReference w:type="default" r:id="rId8"/>
+      <w:footerReference w:type="default" r:id="rId9"/>
       <w:pgSz w:w="11906" w:h="16838"/>
       <w:pgMar w:top="720" w:right="720" w:bottom="720" w:left="720" w:header="142" w:footer="142" w:gutter="0"/>
       <w:cols w:space="708"/>
@@ -4144,16 +4140,6 @@
 </file>
 
 <file path=word/footer1.xml><?xml version="1.0" encoding="utf-8"?>
-<w:ftr xmlns:wpc="http://schemas.microsoft.com/office/word/2010/wordprocessingCanvas" xmlns:cx="http://schemas.microsoft.com/office/drawing/2014/chartex" xmlns:cx1="http://schemas.microsoft.com/office/drawing/2015/9/8/chartex" xmlns:cx2="http://schemas.microsoft.com/office/drawing/2015/10/21/chartex" xmlns:cx3="http://schemas.microsoft.com/office/drawing/2016/5/9/chartex" xmlns:cx4="http://schemas.microsoft.com/office/drawing/2016/5/10/chartex" xmlns:cx5="http://schemas.microsoft.com/office/drawing/2016/5/11/chartex" xmlns:cx6="http://schemas.microsoft.com/office/drawing/2016/5/12/chartex" xmlns:cx7="http://schemas.microsoft.com/office/drawing/2016/5/13/chartex" xmlns:cx8="http://schemas.microsoft.com/office/drawing/2016/5/14/chartex" xmlns:mc="http://schemas.openxmlformats.org/markup-compatibility/2006" xmlns:aink="http://schemas.microsoft.com/office/drawing/2016/ink" xmlns:am3d="http://schemas.microsoft.com/office/drawing/2017/model3d" xmlns:o="urn:schemas-microsoft-com:office:office" xmlns:oel="http://schemas.microsoft.com/office/2019/extlst" xmlns:r="http://schemas.openxmlformats.org/officeDocument/2006/relationships" xmlns:m="http://schemas.openxmlformats.org/officeDocument/2006/math" xmlns:v="urn:schemas-microsoft-com:vml" xmlns:wp14="http://schemas.microsoft.com/office/word/2010/wordprocessingDrawing" xmlns:wp="http://schemas.openxmlformats.org/drawingml/2006/wordprocessingDrawing" xmlns:w10="urn:schemas-microsoft-com:office:word" xmlns:w="http://schemas.openxmlformats.org/wordprocessingml/2006/main" xmlns:w14="http://schemas.microsoft.com/office/word/2010/wordml" xmlns:w15="http://schemas.microsoft.com/office/word/2012/wordml" xmlns:w16cex="http://schemas.microsoft.com/office/word/2018/wordml/cex" xmlns:w16cid="http://schemas.microsoft.com/office/word/2016/wordml/cid" xmlns:w16="http://schemas.microsoft.com/office/word/2018/wordml" xmlns:w16sdtdh="http://schemas.microsoft.com/office/word/2020/wordml/sdtdatahash" xmlns:w16se="http://schemas.microsoft.com/office/word/2015/wordml/symex" xmlns:wpg="http://schemas.microsoft.com/office/word/2010/wordprocessingGroup" xmlns:wpi="http://schemas.microsoft.com/office/word/2010/wordprocessingInk" xmlns:wne="http://schemas.microsoft.com/office/word/2006/wordml" xmlns:wps="http://schemas.microsoft.com/office/word/2010/wordprocessingShape" mc:Ignorable="w14 w15 w16se w16cid w16 w16cex w16sdtdh wp14">
-  <w:p>
-    <w:pPr>
-      <w:pStyle w:val="Pieddepage"/>
-    </w:pPr>
-  </w:p>
-</w:ftr>
-</file>
-
-<file path=word/footer2.xml><?xml version="1.0" encoding="utf-8"?>
 <w:ftr xmlns:wpc="http://schemas.microsoft.com/office/word/2010/wordprocessingCanvas" xmlns:cx="http://schemas.microsoft.com/office/drawing/2014/chartex" xmlns:cx1="http://schemas.microsoft.com/office/drawing/2015/9/8/chartex" xmlns:cx2="http://schemas.microsoft.com/office/drawing/2015/10/21/chartex" xmlns:cx3="http://schemas.microsoft.com/office/drawing/2016/5/9/chartex" xmlns:cx4="http://schemas.microsoft.com/office/drawing/2016/5/10/chartex" xmlns:cx5="http://schemas.microsoft.com/office/drawing/2016/5/11/chartex" xmlns:cx6="http://schemas.microsoft.com/office/drawing/2016/5/12/chartex" xmlns:cx7="http://schemas.microsoft.com/office/drawing/2016/5/13/chartex" xmlns:cx8="http://schemas.microsoft.com/office/drawing/2016/5/14/chartex" xmlns:mc="http://schemas.openxmlformats.org/markup-compatibility/2006" xmlns:aink="http://schemas.microsoft.com/office/drawing/2016/ink" xmlns:am3d="http://schemas.microsoft.com/office/drawing/2017/model3d" xmlns:o="urn:schemas-microsoft-com:office:office" xmlns:oel="http://schemas.microsoft.com/office/2019/extlst" xmlns:r="http://schemas.openxmlformats.org/officeDocument/2006/relationships" xmlns:m="http://schemas.openxmlformats.org/officeDocument/2006/math" xmlns:v="urn:schemas-microsoft-com:vml" xmlns:wp14="http://schemas.microsoft.com/office/word/2010/wordprocessingDrawing" xmlns:wp="http://schemas.openxmlformats.org/drawingml/2006/wordprocessingDrawing" xmlns:w10="urn:schemas-microsoft-com:office:word" xmlns:w="http://schemas.openxmlformats.org/wordprocessingml/2006/main" xmlns:w14="http://schemas.microsoft.com/office/word/2010/wordml" xmlns:w15="http://schemas.microsoft.com/office/word/2012/wordml" xmlns:w16cex="http://schemas.microsoft.com/office/word/2018/wordml/cex" xmlns:w16cid="http://schemas.microsoft.com/office/word/2016/wordml/cid" xmlns:w16="http://schemas.microsoft.com/office/word/2018/wordml" xmlns:w16sdtdh="http://schemas.microsoft.com/office/word/2020/wordml/sdtdatahash" xmlns:w16se="http://schemas.microsoft.com/office/word/2015/wordml/symex" xmlns:wpg="http://schemas.microsoft.com/office/word/2010/wordprocessingGroup" xmlns:wpi="http://schemas.microsoft.com/office/word/2010/wordprocessingInk" xmlns:wne="http://schemas.microsoft.com/office/word/2006/wordml" xmlns:wps="http://schemas.microsoft.com/office/word/2010/wordprocessingShape" mc:Ignorable="w14 w15 w16se w16cid w16 w16cex w16sdtdh wp14">
   <w:tbl>
     <w:tblPr>
@@ -4370,16 +4356,6 @@
 </w:ftr>
 </file>
 
-<file path=word/footer3.xml><?xml version="1.0" encoding="utf-8"?>
-<w:ftr xmlns:wpc="http://schemas.microsoft.com/office/word/2010/wordprocessingCanvas" xmlns:cx="http://schemas.microsoft.com/office/drawing/2014/chartex" xmlns:cx1="http://schemas.microsoft.com/office/drawing/2015/9/8/chartex" xmlns:cx2="http://schemas.microsoft.com/office/drawing/2015/10/21/chartex" xmlns:cx3="http://schemas.microsoft.com/office/drawing/2016/5/9/chartex" xmlns:cx4="http://schemas.microsoft.com/office/drawing/2016/5/10/chartex" xmlns:cx5="http://schemas.microsoft.com/office/drawing/2016/5/11/chartex" xmlns:cx6="http://schemas.microsoft.com/office/drawing/2016/5/12/chartex" xmlns:cx7="http://schemas.microsoft.com/office/drawing/2016/5/13/chartex" xmlns:cx8="http://schemas.microsoft.com/office/drawing/2016/5/14/chartex" xmlns:mc="http://schemas.openxmlformats.org/markup-compatibility/2006" xmlns:aink="http://schemas.microsoft.com/office/drawing/2016/ink" xmlns:am3d="http://schemas.microsoft.com/office/drawing/2017/model3d" xmlns:o="urn:schemas-microsoft-com:office:office" xmlns:oel="http://schemas.microsoft.com/office/2019/extlst" xmlns:r="http://schemas.openxmlformats.org/officeDocument/2006/relationships" xmlns:m="http://schemas.openxmlformats.org/officeDocument/2006/math" xmlns:v="urn:schemas-microsoft-com:vml" xmlns:wp14="http://schemas.microsoft.com/office/word/2010/wordprocessingDrawing" xmlns:wp="http://schemas.openxmlformats.org/drawingml/2006/wordprocessingDrawing" xmlns:w10="urn:schemas-microsoft-com:office:word" xmlns:w="http://schemas.openxmlformats.org/wordprocessingml/2006/main" xmlns:w14="http://schemas.microsoft.com/office/word/2010/wordml" xmlns:w15="http://schemas.microsoft.com/office/word/2012/wordml" xmlns:w16cex="http://schemas.microsoft.com/office/word/2018/wordml/cex" xmlns:w16cid="http://schemas.microsoft.com/office/word/2016/wordml/cid" xmlns:w16="http://schemas.microsoft.com/office/word/2018/wordml" xmlns:w16sdtdh="http://schemas.microsoft.com/office/word/2020/wordml/sdtdatahash" xmlns:w16se="http://schemas.microsoft.com/office/word/2015/wordml/symex" xmlns:wpg="http://schemas.microsoft.com/office/word/2010/wordprocessingGroup" xmlns:wpi="http://schemas.microsoft.com/office/word/2010/wordprocessingInk" xmlns:wne="http://schemas.microsoft.com/office/word/2006/wordml" xmlns:wps="http://schemas.microsoft.com/office/word/2010/wordprocessingShape" mc:Ignorable="w14 w15 w16se w16cid w16 w16cex w16sdtdh wp14">
-  <w:p>
-    <w:pPr>
-      <w:pStyle w:val="Pieddepage"/>
-    </w:pPr>
-  </w:p>
-</w:ftr>
-</file>
-
 <file path=word/footnotes.xml><?xml version="1.0" encoding="utf-8"?>
 <w:footnotes xmlns:wpc="http://schemas.microsoft.com/office/word/2010/wordprocessingCanvas" xmlns:cx="http://schemas.microsoft.com/office/drawing/2014/chartex" xmlns:cx1="http://schemas.microsoft.com/office/drawing/2015/9/8/chartex" xmlns:cx2="http://schemas.microsoft.com/office/drawing/2015/10/21/chartex" xmlns:cx3="http://schemas.microsoft.com/office/drawing/2016/5/9/chartex" xmlns:cx4="http://schemas.microsoft.com/office/drawing/2016/5/10/chartex" xmlns:cx5="http://schemas.microsoft.com/office/drawing/2016/5/11/chartex" xmlns:cx6="http://schemas.microsoft.com/office/drawing/2016/5/12/chartex" xmlns:cx7="http://schemas.microsoft.com/office/drawing/2016/5/13/chartex" xmlns:cx8="http://schemas.microsoft.com/office/drawing/2016/5/14/chartex" xmlns:mc="http://schemas.openxmlformats.org/markup-compatibility/2006" xmlns:aink="http://schemas.microsoft.com/office/drawing/2016/ink" xmlns:am3d="http://schemas.microsoft.com/office/drawing/2017/model3d" xmlns:o="urn:schemas-microsoft-com:office:office" xmlns:oel="http://schemas.microsoft.com/office/2019/extlst" xmlns:r="http://schemas.openxmlformats.org/officeDocument/2006/relationships" xmlns:m="http://schemas.openxmlformats.org/officeDocument/2006/math" xmlns:v="urn:schemas-microsoft-com:vml" xmlns:wp14="http://schemas.microsoft.com/office/word/2010/wordprocessingDrawing" xmlns:wp="http://schemas.openxmlformats.org/drawingml/2006/wordprocessingDrawing" xmlns:w10="urn:schemas-microsoft-com:office:word" xmlns:w="http://schemas.openxmlformats.org/wordprocessingml/2006/main" xmlns:w14="http://schemas.microsoft.com/office/word/2010/wordml" xmlns:w15="http://schemas.microsoft.com/office/word/2012/wordml" xmlns:w16cex="http://schemas.microsoft.com/office/word/2018/wordml/cex" xmlns:w16cid="http://schemas.microsoft.com/office/word/2016/wordml/cid" xmlns:w16="http://schemas.microsoft.com/office/word/2018/wordml" xmlns:w16sdtdh="http://schemas.microsoft.com/office/word/2020/wordml/sdtdatahash" xmlns:w16se="http://schemas.microsoft.com/office/word/2015/wordml/symex" xmlns:wpg="http://schemas.microsoft.com/office/word/2010/wordprocessingGroup" xmlns:wpi="http://schemas.microsoft.com/office/word/2010/wordprocessingInk" xmlns:wne="http://schemas.microsoft.com/office/word/2006/wordml" xmlns:wps="http://schemas.microsoft.com/office/word/2010/wordprocessingShape" mc:Ignorable="w14 w15 w16se w16cid w16 w16cex w16sdtdh wp14">
   <w:footnote w:type="separator" w:id="-1">
@@ -4406,16 +4382,6 @@
 </file>
 
 <file path=word/header1.xml><?xml version="1.0" encoding="utf-8"?>
-<w:hdr xmlns:wpc="http://schemas.microsoft.com/office/word/2010/wordprocessingCanvas" xmlns:cx="http://schemas.microsoft.com/office/drawing/2014/chartex" xmlns:cx1="http://schemas.microsoft.com/office/drawing/2015/9/8/chartex" xmlns:cx2="http://schemas.microsoft.com/office/drawing/2015/10/21/chartex" xmlns:cx3="http://schemas.microsoft.com/office/drawing/2016/5/9/chartex" xmlns:cx4="http://schemas.microsoft.com/office/drawing/2016/5/10/chartex" xmlns:cx5="http://schemas.microsoft.com/office/drawing/2016/5/11/chartex" xmlns:cx6="http://schemas.microsoft.com/office/drawing/2016/5/12/chartex" xmlns:cx7="http://schemas.microsoft.com/office/drawing/2016/5/13/chartex" xmlns:cx8="http://schemas.microsoft.com/office/drawing/2016/5/14/chartex" xmlns:mc="http://schemas.openxmlformats.org/markup-compatibility/2006" xmlns:aink="http://schemas.microsoft.com/office/drawing/2016/ink" xmlns:am3d="http://schemas.microsoft.com/office/drawing/2017/model3d" xmlns:o="urn:schemas-microsoft-com:office:office" xmlns:oel="http://schemas.microsoft.com/office/2019/extlst" xmlns:r="http://schemas.openxmlformats.org/officeDocument/2006/relationships" xmlns:m="http://schemas.openxmlformats.org/officeDocument/2006/math" xmlns:v="urn:schemas-microsoft-com:vml" xmlns:wp14="http://schemas.microsoft.com/office/word/2010/wordprocessingDrawing" xmlns:wp="http://schemas.openxmlformats.org/drawingml/2006/wordprocessingDrawing" xmlns:w10="urn:schemas-microsoft-com:office:word" xmlns:w="http://schemas.openxmlformats.org/wordprocessingml/2006/main" xmlns:w14="http://schemas.microsoft.com/office/word/2010/wordml" xmlns:w15="http://schemas.microsoft.com/office/word/2012/wordml" xmlns:w16cex="http://schemas.microsoft.com/office/word/2018/wordml/cex" xmlns:w16cid="http://schemas.microsoft.com/office/word/2016/wordml/cid" xmlns:w16="http://schemas.microsoft.com/office/word/2018/wordml" xmlns:w16sdtdh="http://schemas.microsoft.com/office/word/2020/wordml/sdtdatahash" xmlns:w16se="http://schemas.microsoft.com/office/word/2015/wordml/symex" xmlns:wpg="http://schemas.microsoft.com/office/word/2010/wordprocessingGroup" xmlns:wpi="http://schemas.microsoft.com/office/word/2010/wordprocessingInk" xmlns:wne="http://schemas.microsoft.com/office/word/2006/wordml" xmlns:wps="http://schemas.microsoft.com/office/word/2010/wordprocessingShape" mc:Ignorable="w14 w15 w16se w16cid w16 w16cex w16sdtdh wp14">
-  <w:p>
-    <w:pPr>
-      <w:pStyle w:val="En-tte"/>
-    </w:pPr>
-  </w:p>
-</w:hdr>
-</file>
-
-<file path=word/header2.xml><?xml version="1.0" encoding="utf-8"?>
 <w:hdr xmlns:wpc="http://schemas.microsoft.com/office/word/2010/wordprocessingCanvas" xmlns:cx="http://schemas.microsoft.com/office/drawing/2014/chartex" xmlns:cx1="http://schemas.microsoft.com/office/drawing/2015/9/8/chartex" xmlns:cx2="http://schemas.microsoft.com/office/drawing/2015/10/21/chartex" xmlns:cx3="http://schemas.microsoft.com/office/drawing/2016/5/9/chartex" xmlns:cx4="http://schemas.microsoft.com/office/drawing/2016/5/10/chartex" xmlns:cx5="http://schemas.microsoft.com/office/drawing/2016/5/11/chartex" xmlns:cx6="http://schemas.microsoft.com/office/drawing/2016/5/12/chartex" xmlns:cx7="http://schemas.microsoft.com/office/drawing/2016/5/13/chartex" xmlns:cx8="http://schemas.microsoft.com/office/drawing/2016/5/14/chartex" xmlns:mc="http://schemas.openxmlformats.org/markup-compatibility/2006" xmlns:aink="http://schemas.microsoft.com/office/drawing/2016/ink" xmlns:am3d="http://schemas.microsoft.com/office/drawing/2017/model3d" xmlns:o="urn:schemas-microsoft-com:office:office" xmlns:oel="http://schemas.microsoft.com/office/2019/extlst" xmlns:r="http://schemas.openxmlformats.org/officeDocument/2006/relationships" xmlns:m="http://schemas.openxmlformats.org/officeDocument/2006/math" xmlns:v="urn:schemas-microsoft-com:vml" xmlns:wp14="http://schemas.microsoft.com/office/word/2010/wordprocessingDrawing" xmlns:wp="http://schemas.openxmlformats.org/drawingml/2006/wordprocessingDrawing" xmlns:w10="urn:schemas-microsoft-com:office:word" xmlns:w="http://schemas.openxmlformats.org/wordprocessingml/2006/main" xmlns:w14="http://schemas.microsoft.com/office/word/2010/wordml" xmlns:w15="http://schemas.microsoft.com/office/word/2012/wordml" xmlns:w16cex="http://schemas.microsoft.com/office/word/2018/wordml/cex" xmlns:w16cid="http://schemas.microsoft.com/office/word/2016/wordml/cid" xmlns:w16="http://schemas.microsoft.com/office/word/2018/wordml" xmlns:w16sdtdh="http://schemas.microsoft.com/office/word/2020/wordml/sdtdatahash" xmlns:w16se="http://schemas.microsoft.com/office/word/2015/wordml/symex" xmlns:wpg="http://schemas.microsoft.com/office/word/2010/wordprocessingGroup" xmlns:wpi="http://schemas.microsoft.com/office/word/2010/wordprocessingInk" xmlns:wne="http://schemas.microsoft.com/office/word/2006/wordml" xmlns:wps="http://schemas.microsoft.com/office/word/2010/wordprocessingShape" mc:Ignorable="w14 w15 w16se w16cid w16 w16cex w16sdtdh wp14">
   <w:tbl>
     <w:tblPr>
@@ -4604,6 +4570,57 @@
               <w:sz w:val="20"/>
               <w:szCs w:val="20"/>
             </w:rPr>
+            <w:instrText xml:space="preserve"> MERGEFIELD  #if($nomSousDirection)  \* MERGEFORMAT </w:instrText>
+          </w:r>
+          <w:r>
+            <w:rPr>
+              <w:rFonts w:ascii="Times New Roman" w:hAnsi="Times New Roman" w:cs="Times New Roman"/>
+              <w:i/>
+              <w:iCs/>
+              <w:sz w:val="20"/>
+              <w:szCs w:val="20"/>
+            </w:rPr>
+            <w:fldChar w:fldCharType="separate"/>
+          </w:r>
+          <w:r>
+            <w:rPr>
+              <w:rFonts w:ascii="Times New Roman" w:hAnsi="Times New Roman" w:cs="Times New Roman"/>
+              <w:i/>
+              <w:iCs/>
+              <w:noProof/>
+              <w:sz w:val="20"/>
+              <w:szCs w:val="20"/>
+            </w:rPr>
+            <w:t>«#if($nomSousDirection)»</w:t>
+          </w:r>
+          <w:r>
+            <w:rPr>
+              <w:rFonts w:ascii="Times New Roman" w:hAnsi="Times New Roman" w:cs="Times New Roman"/>
+              <w:i/>
+              <w:iCs/>
+              <w:sz w:val="20"/>
+              <w:szCs w:val="20"/>
+            </w:rPr>
+            <w:fldChar w:fldCharType="end"/>
+          </w:r>
+          <w:r>
+            <w:rPr>
+              <w:rFonts w:ascii="Times New Roman" w:hAnsi="Times New Roman" w:cs="Times New Roman"/>
+              <w:i/>
+              <w:iCs/>
+              <w:sz w:val="20"/>
+              <w:szCs w:val="20"/>
+            </w:rPr>
+            <w:fldChar w:fldCharType="begin"/>
+          </w:r>
+          <w:r>
+            <w:rPr>
+              <w:rFonts w:ascii="Times New Roman" w:hAnsi="Times New Roman" w:cs="Times New Roman"/>
+              <w:i/>
+              <w:iCs/>
+              <w:sz w:val="20"/>
+              <w:szCs w:val="20"/>
+            </w:rPr>
             <w:instrText xml:space="preserve"> MERGEFIELD  $nomSousDirection  \* MERGEFORMAT </w:instrText>
           </w:r>
           <w:r>
@@ -4626,6 +4643,57 @@
               <w:szCs w:val="20"/>
             </w:rPr>
             <w:t>«$nomSousDirection»</w:t>
+          </w:r>
+          <w:r>
+            <w:rPr>
+              <w:rFonts w:ascii="Times New Roman" w:hAnsi="Times New Roman" w:cs="Times New Roman"/>
+              <w:i/>
+              <w:iCs/>
+              <w:sz w:val="20"/>
+              <w:szCs w:val="20"/>
+            </w:rPr>
+            <w:fldChar w:fldCharType="end"/>
+          </w:r>
+          <w:r>
+            <w:rPr>
+              <w:rFonts w:ascii="Times New Roman" w:hAnsi="Times New Roman" w:cs="Times New Roman"/>
+              <w:i/>
+              <w:iCs/>
+              <w:sz w:val="20"/>
+              <w:szCs w:val="20"/>
+            </w:rPr>
+            <w:fldChar w:fldCharType="begin"/>
+          </w:r>
+          <w:r>
+            <w:rPr>
+              <w:rFonts w:ascii="Times New Roman" w:hAnsi="Times New Roman" w:cs="Times New Roman"/>
+              <w:i/>
+              <w:iCs/>
+              <w:sz w:val="20"/>
+              <w:szCs w:val="20"/>
+            </w:rPr>
+            <w:instrText xml:space="preserve"> MERGEFIELD  #end  \* MERGEFORMAT </w:instrText>
+          </w:r>
+          <w:r>
+            <w:rPr>
+              <w:rFonts w:ascii="Times New Roman" w:hAnsi="Times New Roman" w:cs="Times New Roman"/>
+              <w:i/>
+              <w:iCs/>
+              <w:sz w:val="20"/>
+              <w:szCs w:val="20"/>
+            </w:rPr>
+            <w:fldChar w:fldCharType="separate"/>
+          </w:r>
+          <w:r>
+            <w:rPr>
+              <w:rFonts w:ascii="Times New Roman" w:hAnsi="Times New Roman" w:cs="Times New Roman"/>
+              <w:i/>
+              <w:iCs/>
+              <w:noProof/>
+              <w:sz w:val="20"/>
+              <w:szCs w:val="20"/>
+            </w:rPr>
+            <w:t>«#end»</w:t>
           </w:r>
           <w:r>
             <w:rPr>
@@ -4824,16 +4892,6 @@
 </w:hdr>
 </file>
 
-<file path=word/header3.xml><?xml version="1.0" encoding="utf-8"?>
-<w:hdr xmlns:wpc="http://schemas.microsoft.com/office/word/2010/wordprocessingCanvas" xmlns:cx="http://schemas.microsoft.com/office/drawing/2014/chartex" xmlns:cx1="http://schemas.microsoft.com/office/drawing/2015/9/8/chartex" xmlns:cx2="http://schemas.microsoft.com/office/drawing/2015/10/21/chartex" xmlns:cx3="http://schemas.microsoft.com/office/drawing/2016/5/9/chartex" xmlns:cx4="http://schemas.microsoft.com/office/drawing/2016/5/10/chartex" xmlns:cx5="http://schemas.microsoft.com/office/drawing/2016/5/11/chartex" xmlns:cx6="http://schemas.microsoft.com/office/drawing/2016/5/12/chartex" xmlns:cx7="http://schemas.microsoft.com/office/drawing/2016/5/13/chartex" xmlns:cx8="http://schemas.microsoft.com/office/drawing/2016/5/14/chartex" xmlns:mc="http://schemas.openxmlformats.org/markup-compatibility/2006" xmlns:aink="http://schemas.microsoft.com/office/drawing/2016/ink" xmlns:am3d="http://schemas.microsoft.com/office/drawing/2017/model3d" xmlns:o="urn:schemas-microsoft-com:office:office" xmlns:oel="http://schemas.microsoft.com/office/2019/extlst" xmlns:r="http://schemas.openxmlformats.org/officeDocument/2006/relationships" xmlns:m="http://schemas.openxmlformats.org/officeDocument/2006/math" xmlns:v="urn:schemas-microsoft-com:vml" xmlns:wp14="http://schemas.microsoft.com/office/word/2010/wordprocessingDrawing" xmlns:wp="http://schemas.openxmlformats.org/drawingml/2006/wordprocessingDrawing" xmlns:w10="urn:schemas-microsoft-com:office:word" xmlns:w="http://schemas.openxmlformats.org/wordprocessingml/2006/main" xmlns:w14="http://schemas.microsoft.com/office/word/2010/wordml" xmlns:w15="http://schemas.microsoft.com/office/word/2012/wordml" xmlns:w16cex="http://schemas.microsoft.com/office/word/2018/wordml/cex" xmlns:w16cid="http://schemas.microsoft.com/office/word/2016/wordml/cid" xmlns:w16="http://schemas.microsoft.com/office/word/2018/wordml" xmlns:w16sdtdh="http://schemas.microsoft.com/office/word/2020/wordml/sdtdatahash" xmlns:w16se="http://schemas.microsoft.com/office/word/2015/wordml/symex" xmlns:wpg="http://schemas.microsoft.com/office/word/2010/wordprocessingGroup" xmlns:wpi="http://schemas.microsoft.com/office/word/2010/wordprocessingInk" xmlns:wne="http://schemas.microsoft.com/office/word/2006/wordml" xmlns:wps="http://schemas.microsoft.com/office/word/2010/wordprocessingShape" mc:Ignorable="w14 w15 w16se w16cid w16 w16cex w16sdtdh wp14">
-  <w:p>
-    <w:pPr>
-      <w:pStyle w:val="En-tte"/>
-    </w:pPr>
-  </w:p>
-</w:hdr>
-</file>
-
 <file path=word/numbering.xml><?xml version="1.0" encoding="utf-8"?>
 <w:numbering xmlns:wpc="http://schemas.microsoft.com/office/word/2010/wordprocessingCanvas" xmlns:cx="http://schemas.microsoft.com/office/drawing/2014/chartex" xmlns:cx1="http://schemas.microsoft.com/office/drawing/2015/9/8/chartex" xmlns:cx2="http://schemas.microsoft.com/office/drawing/2015/10/21/chartex" xmlns:cx3="http://schemas.microsoft.com/office/drawing/2016/5/9/chartex" xmlns:cx4="http://schemas.microsoft.com/office/drawing/2016/5/10/chartex" xmlns:cx5="http://schemas.microsoft.com/office/drawing/2016/5/11/chartex" xmlns:cx6="http://schemas.microsoft.com/office/drawing/2016/5/12/chartex" xmlns:cx7="http://schemas.microsoft.com/office/drawing/2016/5/13/chartex" xmlns:cx8="http://schemas.microsoft.com/office/drawing/2016/5/14/chartex" xmlns:mc="http://schemas.openxmlformats.org/markup-compatibility/2006" xmlns:aink="http://schemas.microsoft.com/office/drawing/2016/ink" xmlns:am3d="http://schemas.microsoft.com/office/drawing/2017/model3d" xmlns:o="urn:schemas-microsoft-com:office:office" xmlns:oel="http://schemas.microsoft.com/office/2019/extlst" xmlns:r="http://schemas.openxmlformats.org/officeDocument/2006/relationships" xmlns:m="http://schemas.openxmlformats.org/officeDocument/2006/math" xmlns:v="urn:schemas-microsoft-com:vml" xmlns:wp14="http://schemas.microsoft.com/office/word/2010/wordprocessingDrawing" xmlns:wp="http://schemas.openxmlformats.org/drawingml/2006/wordprocessingDrawing" xmlns:w10="urn:schemas-microsoft-com:office:word" xmlns:w="http://schemas.openxmlformats.org/wordprocessingml/2006/main" xmlns:w14="http://schemas.microsoft.com/office/word/2010/wordml" xmlns:w15="http://schemas.microsoft.com/office/word/2012/wordml" xmlns:w16cex="http://schemas.microsoft.com/office/word/2018/wordml/cex" xmlns:w16cid="http://schemas.microsoft.com/office/word/2016/wordml/cid" xmlns:w16="http://schemas.microsoft.com/office/word/2018/wordml" xmlns:w16sdtdh="http://schemas.microsoft.com/office/word/2020/wordml/sdtdatahash" xmlns:w16se="http://schemas.microsoft.com/office/word/2015/wordml/symex" xmlns:wpg="http://schemas.microsoft.com/office/word/2010/wordprocessingGroup" xmlns:wpi="http://schemas.microsoft.com/office/word/2010/wordprocessingInk" xmlns:wne="http://schemas.microsoft.com/office/word/2006/wordml" xmlns:wps="http://schemas.microsoft.com/office/word/2010/wordprocessingShape" mc:Ignorable="w14 w15 w16se w16cid w16 w16cex w16sdtdh wp14">
   <w:numPicBullet w:numPicBulletId="0">
@@ -4857,7 +4915,7 @@
         <v:path o:extrusionok="f" gradientshapeok="t" o:connecttype="rect"/>
         <o:lock v:ext="edit" aspectratio="t"/>
       </v:shapetype>
-      <v:shape id="_x0000_i1032" type="#_x0000_t75" style="width:12.1pt;height:12.1pt;visibility:visible;mso-wrap-style:square" o:bullet="t">
+      <v:shape id="_x0000_i1032" type="#_x0000_t75" style="width:12.35pt;height:12.35pt;visibility:visible;mso-wrap-style:square" o:bullet="t">
         <v:imagedata r:id="rId1" o:title=""/>
       </v:shape>
     </w:pict>

</xml_diff>